<commit_message>
Modernize generated document system
</commit_message>
<xml_diff>
--- a/documents/docx_templates/platform_note_template.docx
+++ b/documents/docx_templates/platform_note_template.docx
@@ -2,197 +2,719 @@
 <file path=word/document.xml><?xml version="1.0" encoding="utf-8"?>
 <w:document xmlns:wpc="http://schemas.microsoft.com/office/word/2010/wordprocessingCanvas" xmlns:mo="http://schemas.microsoft.com/office/mac/office/2008/main" xmlns:mc="http://schemas.openxmlformats.org/markup-compatibility/2006" xmlns:mv="urn:schemas-microsoft-com:mac:vml" xmlns:o="urn:schemas-microsoft-com:office:office" xmlns:r="http://schemas.openxmlformats.org/officeDocument/2006/relationships" xmlns:m="http://schemas.openxmlformats.org/officeDocument/2006/math" xmlns:v="urn:schemas-microsoft-com:vml" xmlns:wp14="http://schemas.microsoft.com/office/word/2010/wordprocessingDrawing" xmlns:wp="http://schemas.openxmlformats.org/drawingml/2006/wordprocessingDrawing" xmlns:w10="urn:schemas-microsoft-com:office:word" xmlns:w="http://schemas.openxmlformats.org/wordprocessingml/2006/main" xmlns:w14="http://schemas.microsoft.com/office/word/2010/wordml" xmlns:wpg="http://schemas.microsoft.com/office/word/2010/wordprocessingGroup" xmlns:wpi="http://schemas.microsoft.com/office/word/2010/wordprocessingInk" xmlns:wne="http://schemas.microsoft.com/office/word/2006/wordml" xmlns:wps="http://schemas.microsoft.com/office/word/2010/wordprocessingShape" mc:Ignorable="w14 wp14">
   <w:body>
+    <w:tbl>
+      <w:tblPr>
+        <w:tblW w:type="auto" w:w="0"/>
+        <w:tblLayout w:type="fixed"/>
+        <w:tblLook w:firstColumn="1" w:firstRow="1" w:lastColumn="0" w:lastRow="0" w:noHBand="0" w:noVBand="1" w:val="04A0"/>
+      </w:tblPr>
+      <w:tblGrid>
+        <w:gridCol w:w="4989"/>
+        <w:gridCol w:w="4989"/>
+      </w:tblGrid>
+      <w:tr>
+        <w:tc>
+          <w:tcPr>
+            <w:tcW w:type="dxa" w:w="7654"/>
+            <w:tcBorders>
+              <w:bottom w:val="single" w:sz="14" w:color="4F46E5"/>
+            </w:tcBorders>
+            <w:tcMar>
+              <w:top w:w="50" w:type="dxa"/>
+              <w:start w:w="0" w:type="dxa"/>
+              <w:bottom w:w="80" w:type="dxa"/>
+              <w:end w:w="0" w:type="dxa"/>
+            </w:tcMar>
+          </w:tcPr>
+          <w:p>
+            <w:pPr>
+              <w:spacing w:before="0" w:after="0" w:line="252" w:lineRule="auto"/>
+            </w:pPr>
+            <w:r/>
+            <w:r>
+              <w:rPr>
+                <w:rFonts w:ascii="Arial" w:hAnsi="Arial" w:cs="Arial" w:eastAsia="Arial"/>
+                <w:b/>
+                <w:color w:val="24364B"/>
+                <w:sz w:val="36"/>
+              </w:rPr>
+              <w:t>NOTE DE PLATEFORME</w:t>
+            </w:r>
+          </w:p>
+          <w:p>
+            <w:pPr>
+              <w:spacing w:before="0" w:after="0" w:line="252" w:lineRule="auto"/>
+            </w:pPr>
+            <w:r/>
+            <w:r>
+              <w:rPr>
+                <w:rFonts w:ascii="Arial" w:hAnsi="Arial" w:cs="Arial" w:eastAsia="Arial"/>
+                <w:b w:val="0"/>
+                <w:color w:val="64748B"/>
+                <w:sz w:val="18"/>
+              </w:rPr>
+              <w:t>PLAGENOR — synthèse opérationnelle de la demande</w:t>
+            </w:r>
+          </w:p>
+        </w:tc>
+        <w:tc>
+          <w:tcPr>
+            <w:tcW w:type="dxa" w:w="2211"/>
+            <w:tcBorders>
+              <w:bottom w:val="single" w:sz="14" w:color="4F46E5"/>
+            </w:tcBorders>
+            <w:tcMar>
+              <w:top w:w="50" w:type="dxa"/>
+              <w:start w:w="0" w:type="dxa"/>
+              <w:bottom w:w="80" w:type="dxa"/>
+              <w:end w:w="0" w:type="dxa"/>
+            </w:tcMar>
+          </w:tcPr>
+          <w:p>
+            <w:pPr>
+              <w:spacing w:before="0" w:after="0" w:line="252" w:lineRule="auto"/>
+              <w:jc w:val="right"/>
+            </w:pPr>
+            <w:r/>
+            <w:r>
+              <w:rPr>
+                <w:rFonts w:ascii="Arial" w:hAnsi="Arial" w:cs="Arial" w:eastAsia="Arial"/>
+                <w:b/>
+                <w:color w:val="4F46E5"/>
+                <w:sz w:val="19"/>
+              </w:rPr>
+              <w:t>{{DISPLAY_ID}}</w:t>
+            </w:r>
+          </w:p>
+        </w:tc>
+      </w:tr>
+    </w:tbl>
     <w:p>
       <w:pPr>
         <w:pStyle w:val="Heading1"/>
+        <w:keepNext/>
+        <w:pBdr>
+          <w:bottom w:val="single" w:sz="10" w:space="2" w:color="4F46E5"/>
+        </w:pBdr>
       </w:pPr>
       <w:r>
-        <w:t>NOTE DE PLATEFORME — PLAGENOR</w:t>
+        <w:rPr>
+          <w:rFonts w:ascii="Arial" w:hAnsi="Arial" w:cs="Arial" w:eastAsia="Arial"/>
+          <w:b/>
+          <w:color w:val="24364B"/>
+          <w:sz w:val="26"/>
+        </w:rPr>
+        <w:t>Références</w:t>
       </w:r>
     </w:p>
-    <w:p>
-      <w:r>
-        <w:t>ESSBO — École Supérieure en Sciences Biologiques d'Oran</w:t>
-      </w:r>
-    </w:p>
-    <w:p>
-      <w:r>
-        <w:t>Référence : {{DISPLAY_ID}}</w:t>
-      </w:r>
-    </w:p>
-    <w:p>
-      <w:r>
-        <w:t>Date d'émission : {{DATETIME}}</w:t>
-      </w:r>
-    </w:p>
-    <w:p/>
+    <w:tbl>
+      <w:tblPr>
+        <w:tblW w:type="auto" w:w="0"/>
+        <w:tblLook w:firstColumn="1" w:firstRow="1" w:lastColumn="0" w:lastRow="0" w:noHBand="0" w:noVBand="1" w:val="04A0"/>
+      </w:tblPr>
+      <w:tblGrid>
+        <w:gridCol w:w="4989"/>
+        <w:gridCol w:w="4989"/>
+      </w:tblGrid>
+      <w:tr>
+        <w:trPr>
+          <w:cantSplit/>
+        </w:trPr>
+        <w:tc>
+          <w:tcPr>
+            <w:tcW w:type="dxa" w:w="4989"/>
+            <w:tcMar>
+              <w:top w:w="65" w:type="dxa"/>
+              <w:start w:w="105" w:type="dxa"/>
+              <w:bottom w:w="65" w:type="dxa"/>
+              <w:end w:w="105" w:type="dxa"/>
+            </w:tcMar>
+            <w:tcBorders>
+              <w:bottom w:val="single" w:sz="3" w:color="D9E0E8"/>
+            </w:tcBorders>
+            <w:vAlign w:val="center"/>
+            <w:shd w:val="clear" w:color="auto" w:fill="F4F6FA"/>
+          </w:tcPr>
+          <w:p>
+            <w:pPr>
+              <w:spacing w:after="0" w:line="240" w:lineRule="auto"/>
+            </w:pPr>
+            <w:r>
+              <w:rPr>
+                <w:rFonts w:ascii="Arial" w:hAnsi="Arial" w:cs="Arial" w:eastAsia="Arial"/>
+                <w:b/>
+                <w:color w:val="24364B"/>
+                <w:sz w:val="18"/>
+              </w:rPr>
+              <w:t>Référence</w:t>
+            </w:r>
+          </w:p>
+        </w:tc>
+        <w:tc>
+          <w:tcPr>
+            <w:tcW w:type="dxa" w:w="4989"/>
+            <w:tcMar>
+              <w:top w:w="65" w:type="dxa"/>
+              <w:start w:w="105" w:type="dxa"/>
+              <w:bottom w:w="65" w:type="dxa"/>
+              <w:end w:w="105" w:type="dxa"/>
+            </w:tcMar>
+            <w:tcBorders>
+              <w:bottom w:val="single" w:sz="3" w:color="D9E0E8"/>
+            </w:tcBorders>
+            <w:vAlign w:val="center"/>
+          </w:tcPr>
+          <w:p>
+            <w:pPr>
+              <w:spacing w:after="0" w:line="240" w:lineRule="auto"/>
+            </w:pPr>
+            <w:r>
+              <w:rPr>
+                <w:rFonts w:ascii="Arial" w:hAnsi="Arial" w:cs="Arial" w:eastAsia="Arial"/>
+                <w:b w:val="0"/>
+                <w:color w:val="172033"/>
+                <w:sz w:val="18"/>
+              </w:rPr>
+              <w:t>{{DISPLAY_ID}}</w:t>
+            </w:r>
+          </w:p>
+        </w:tc>
+      </w:tr>
+      <w:tr>
+        <w:trPr>
+          <w:cantSplit/>
+        </w:trPr>
+        <w:tc>
+          <w:tcPr>
+            <w:tcW w:type="dxa" w:w="4989"/>
+            <w:tcMar>
+              <w:top w:w="65" w:type="dxa"/>
+              <w:start w:w="105" w:type="dxa"/>
+              <w:bottom w:w="65" w:type="dxa"/>
+              <w:end w:w="105" w:type="dxa"/>
+            </w:tcMar>
+            <w:tcBorders>
+              <w:bottom w:val="single" w:sz="3" w:color="D9E0E8"/>
+            </w:tcBorders>
+            <w:vAlign w:val="center"/>
+            <w:shd w:val="clear" w:color="auto" w:fill="F4F6FA"/>
+          </w:tcPr>
+          <w:p>
+            <w:pPr>
+              <w:spacing w:after="0" w:line="240" w:lineRule="auto"/>
+            </w:pPr>
+            <w:r>
+              <w:rPr>
+                <w:rFonts w:ascii="Arial" w:hAnsi="Arial" w:cs="Arial" w:eastAsia="Arial"/>
+                <w:b/>
+                <w:color w:val="24364B"/>
+                <w:sz w:val="18"/>
+              </w:rPr>
+              <w:t>Date d'émission</w:t>
+            </w:r>
+          </w:p>
+        </w:tc>
+        <w:tc>
+          <w:tcPr>
+            <w:tcW w:type="dxa" w:w="4989"/>
+            <w:tcMar>
+              <w:top w:w="65" w:type="dxa"/>
+              <w:start w:w="105" w:type="dxa"/>
+              <w:bottom w:w="65" w:type="dxa"/>
+              <w:end w:w="105" w:type="dxa"/>
+            </w:tcMar>
+            <w:tcBorders>
+              <w:bottom w:val="single" w:sz="3" w:color="D9E0E8"/>
+            </w:tcBorders>
+            <w:vAlign w:val="center"/>
+          </w:tcPr>
+          <w:p>
+            <w:pPr>
+              <w:spacing w:after="0" w:line="240" w:lineRule="auto"/>
+            </w:pPr>
+            <w:r>
+              <w:rPr>
+                <w:rFonts w:ascii="Arial" w:hAnsi="Arial" w:cs="Arial" w:eastAsia="Arial"/>
+                <w:b w:val="0"/>
+                <w:color w:val="172033"/>
+                <w:sz w:val="18"/>
+              </w:rPr>
+              <w:t>{{DATETIME}}</w:t>
+            </w:r>
+          </w:p>
+        </w:tc>
+      </w:tr>
+    </w:tbl>
     <w:p>
       <w:pPr>
-        <w:pStyle w:val="Heading2"/>
+        <w:pStyle w:val="Heading1"/>
+        <w:keepNext/>
+        <w:pBdr>
+          <w:bottom w:val="single" w:sz="10" w:space="2" w:color="4F46E5"/>
+        </w:pBdr>
       </w:pPr>
       <w:r>
+        <w:rPr>
+          <w:rFonts w:ascii="Arial" w:hAnsi="Arial" w:cs="Arial" w:eastAsia="Arial"/>
+          <w:b/>
+          <w:color w:val="24364B"/>
+          <w:sz w:val="26"/>
+        </w:rPr>
         <w:t>Demandeur</w:t>
       </w:r>
     </w:p>
     <w:tbl>
       <w:tblPr>
-        <w:tblStyle w:val="LightGrid-Accent1"/>
         <w:tblW w:type="auto" w:w="0"/>
         <w:tblLook w:firstColumn="1" w:firstRow="1" w:lastColumn="0" w:lastRow="0" w:noHBand="0" w:noVBand="1" w:val="04A0"/>
       </w:tblPr>
       <w:tblGrid>
-        <w:gridCol w:w="4514"/>
-        <w:gridCol w:w="4514"/>
+        <w:gridCol w:w="4989"/>
+        <w:gridCol w:w="4989"/>
       </w:tblGrid>
       <w:tr>
+        <w:trPr>
+          <w:cantSplit/>
+        </w:trPr>
         <w:tc>
           <w:tcPr>
-            <w:tcW w:type="dxa" w:w="4514"/>
+            <w:tcW w:type="dxa" w:w="4989"/>
+            <w:tcMar>
+              <w:top w:w="65" w:type="dxa"/>
+              <w:start w:w="105" w:type="dxa"/>
+              <w:bottom w:w="65" w:type="dxa"/>
+              <w:end w:w="105" w:type="dxa"/>
+            </w:tcMar>
+            <w:tcBorders>
+              <w:bottom w:val="single" w:sz="3" w:color="D9E0E8"/>
+            </w:tcBorders>
+            <w:vAlign w:val="center"/>
+            <w:shd w:val="clear" w:color="auto" w:fill="F4F6FA"/>
           </w:tcPr>
           <w:p>
+            <w:pPr>
+              <w:spacing w:after="0" w:line="240" w:lineRule="auto"/>
+            </w:pPr>
             <w:r>
+              <w:rPr>
+                <w:rFonts w:ascii="Arial" w:hAnsi="Arial" w:cs="Arial" w:eastAsia="Arial"/>
+                <w:b/>
+                <w:color w:val="24364B"/>
+                <w:sz w:val="18"/>
+              </w:rPr>
               <w:t>Nom complet</w:t>
             </w:r>
           </w:p>
         </w:tc>
         <w:tc>
           <w:tcPr>
-            <w:tcW w:type="dxa" w:w="4514"/>
+            <w:tcW w:type="dxa" w:w="4989"/>
+            <w:tcMar>
+              <w:top w:w="65" w:type="dxa"/>
+              <w:start w:w="105" w:type="dxa"/>
+              <w:bottom w:w="65" w:type="dxa"/>
+              <w:end w:w="105" w:type="dxa"/>
+            </w:tcMar>
+            <w:tcBorders>
+              <w:bottom w:val="single" w:sz="3" w:color="D9E0E8"/>
+            </w:tcBorders>
+            <w:vAlign w:val="center"/>
           </w:tcPr>
           <w:p>
+            <w:pPr>
+              <w:spacing w:after="0" w:line="240" w:lineRule="auto"/>
+            </w:pPr>
             <w:r>
+              <w:rPr>
+                <w:rFonts w:ascii="Arial" w:hAnsi="Arial" w:cs="Arial" w:eastAsia="Arial"/>
+                <w:b w:val="0"/>
+                <w:color w:val="172033"/>
+                <w:sz w:val="18"/>
+              </w:rPr>
               <w:t>{{FULL_NAME}}</w:t>
             </w:r>
           </w:p>
         </w:tc>
       </w:tr>
       <w:tr>
+        <w:trPr>
+          <w:cantSplit/>
+        </w:trPr>
         <w:tc>
           <w:tcPr>
-            <w:tcW w:type="dxa" w:w="4514"/>
+            <w:tcW w:type="dxa" w:w="4989"/>
+            <w:tcMar>
+              <w:top w:w="65" w:type="dxa"/>
+              <w:start w:w="105" w:type="dxa"/>
+              <w:bottom w:w="65" w:type="dxa"/>
+              <w:end w:w="105" w:type="dxa"/>
+            </w:tcMar>
+            <w:tcBorders>
+              <w:bottom w:val="single" w:sz="3" w:color="D9E0E8"/>
+            </w:tcBorders>
+            <w:vAlign w:val="center"/>
+            <w:shd w:val="clear" w:color="auto" w:fill="F4F6FA"/>
           </w:tcPr>
           <w:p>
+            <w:pPr>
+              <w:spacing w:after="0" w:line="240" w:lineRule="auto"/>
+            </w:pPr>
             <w:r>
+              <w:rPr>
+                <w:rFonts w:ascii="Arial" w:hAnsi="Arial" w:cs="Arial" w:eastAsia="Arial"/>
+                <w:b/>
+                <w:color w:val="24364B"/>
+                <w:sz w:val="18"/>
+              </w:rPr>
               <w:t>Établissement</w:t>
             </w:r>
           </w:p>
         </w:tc>
         <w:tc>
           <w:tcPr>
-            <w:tcW w:type="dxa" w:w="4514"/>
+            <w:tcW w:type="dxa" w:w="4989"/>
+            <w:tcMar>
+              <w:top w:w="65" w:type="dxa"/>
+              <w:start w:w="105" w:type="dxa"/>
+              <w:bottom w:w="65" w:type="dxa"/>
+              <w:end w:w="105" w:type="dxa"/>
+            </w:tcMar>
+            <w:tcBorders>
+              <w:bottom w:val="single" w:sz="3" w:color="D9E0E8"/>
+            </w:tcBorders>
+            <w:vAlign w:val="center"/>
           </w:tcPr>
           <w:p>
+            <w:pPr>
+              <w:spacing w:after="0" w:line="240" w:lineRule="auto"/>
+            </w:pPr>
             <w:r>
+              <w:rPr>
+                <w:rFonts w:ascii="Arial" w:hAnsi="Arial" w:cs="Arial" w:eastAsia="Arial"/>
+                <w:b w:val="0"/>
+                <w:color w:val="172033"/>
+                <w:sz w:val="18"/>
+              </w:rPr>
               <w:t>{{ETABLISSEMENT}}</w:t>
             </w:r>
           </w:p>
         </w:tc>
       </w:tr>
       <w:tr>
+        <w:trPr>
+          <w:cantSplit/>
+        </w:trPr>
         <w:tc>
           <w:tcPr>
-            <w:tcW w:type="dxa" w:w="4514"/>
+            <w:tcW w:type="dxa" w:w="4989"/>
+            <w:tcMar>
+              <w:top w:w="65" w:type="dxa"/>
+              <w:start w:w="105" w:type="dxa"/>
+              <w:bottom w:w="65" w:type="dxa"/>
+              <w:end w:w="105" w:type="dxa"/>
+            </w:tcMar>
+            <w:tcBorders>
+              <w:bottom w:val="single" w:sz="3" w:color="D9E0E8"/>
+            </w:tcBorders>
+            <w:vAlign w:val="center"/>
+            <w:shd w:val="clear" w:color="auto" w:fill="F4F6FA"/>
           </w:tcPr>
           <w:p>
+            <w:pPr>
+              <w:spacing w:after="0" w:line="240" w:lineRule="auto"/>
+            </w:pPr>
             <w:r>
+              <w:rPr>
+                <w:rFonts w:ascii="Arial" w:hAnsi="Arial" w:cs="Arial" w:eastAsia="Arial"/>
+                <w:b/>
+                <w:color w:val="24364B"/>
+                <w:sz w:val="18"/>
+              </w:rPr>
               <w:t>Laboratoire</w:t>
             </w:r>
           </w:p>
         </w:tc>
         <w:tc>
           <w:tcPr>
-            <w:tcW w:type="dxa" w:w="4514"/>
+            <w:tcW w:type="dxa" w:w="4989"/>
+            <w:tcMar>
+              <w:top w:w="65" w:type="dxa"/>
+              <w:start w:w="105" w:type="dxa"/>
+              <w:bottom w:w="65" w:type="dxa"/>
+              <w:end w:w="105" w:type="dxa"/>
+            </w:tcMar>
+            <w:tcBorders>
+              <w:bottom w:val="single" w:sz="3" w:color="D9E0E8"/>
+            </w:tcBorders>
+            <w:vAlign w:val="center"/>
           </w:tcPr>
           <w:p>
+            <w:pPr>
+              <w:spacing w:after="0" w:line="240" w:lineRule="auto"/>
+            </w:pPr>
             <w:r>
+              <w:rPr>
+                <w:rFonts w:ascii="Arial" w:hAnsi="Arial" w:cs="Arial" w:eastAsia="Arial"/>
+                <w:b w:val="0"/>
+                <w:color w:val="172033"/>
+                <w:sz w:val="18"/>
+              </w:rPr>
               <w:t>{{LABORATORY}}</w:t>
             </w:r>
           </w:p>
         </w:tc>
       </w:tr>
       <w:tr>
+        <w:trPr>
+          <w:cantSplit/>
+        </w:trPr>
         <w:tc>
           <w:tcPr>
-            <w:tcW w:type="dxa" w:w="4514"/>
+            <w:tcW w:type="dxa" w:w="4989"/>
+            <w:tcMar>
+              <w:top w:w="65" w:type="dxa"/>
+              <w:start w:w="105" w:type="dxa"/>
+              <w:bottom w:w="65" w:type="dxa"/>
+              <w:end w:w="105" w:type="dxa"/>
+            </w:tcMar>
+            <w:tcBorders>
+              <w:bottom w:val="single" w:sz="3" w:color="D9E0E8"/>
+            </w:tcBorders>
+            <w:vAlign w:val="center"/>
+            <w:shd w:val="clear" w:color="auto" w:fill="F4F6FA"/>
           </w:tcPr>
           <w:p>
+            <w:pPr>
+              <w:spacing w:after="0" w:line="240" w:lineRule="auto"/>
+            </w:pPr>
             <w:r>
+              <w:rPr>
+                <w:rFonts w:ascii="Arial" w:hAnsi="Arial" w:cs="Arial" w:eastAsia="Arial"/>
+                <w:b/>
+                <w:color w:val="24364B"/>
+                <w:sz w:val="18"/>
+              </w:rPr>
               <w:t>Niveau / fonction</w:t>
             </w:r>
           </w:p>
         </w:tc>
         <w:tc>
           <w:tcPr>
-            <w:tcW w:type="dxa" w:w="4514"/>
+            <w:tcW w:type="dxa" w:w="4989"/>
+            <w:tcMar>
+              <w:top w:w="65" w:type="dxa"/>
+              <w:start w:w="105" w:type="dxa"/>
+              <w:bottom w:w="65" w:type="dxa"/>
+              <w:end w:w="105" w:type="dxa"/>
+            </w:tcMar>
+            <w:tcBorders>
+              <w:bottom w:val="single" w:sz="3" w:color="D9E0E8"/>
+            </w:tcBorders>
+            <w:vAlign w:val="center"/>
           </w:tcPr>
           <w:p>
+            <w:pPr>
+              <w:spacing w:after="0" w:line="240" w:lineRule="auto"/>
+            </w:pPr>
             <w:r>
+              <w:rPr>
+                <w:rFonts w:ascii="Arial" w:hAnsi="Arial" w:cs="Arial" w:eastAsia="Arial"/>
+                <w:b w:val="0"/>
+                <w:color w:val="172033"/>
+                <w:sz w:val="18"/>
+              </w:rPr>
               <w:t>{{STUDENT_LEVEL}}</w:t>
             </w:r>
           </w:p>
         </w:tc>
       </w:tr>
       <w:tr>
+        <w:trPr>
+          <w:cantSplit/>
+        </w:trPr>
         <w:tc>
           <w:tcPr>
-            <w:tcW w:type="dxa" w:w="4514"/>
+            <w:tcW w:type="dxa" w:w="4989"/>
+            <w:tcMar>
+              <w:top w:w="65" w:type="dxa"/>
+              <w:start w:w="105" w:type="dxa"/>
+              <w:bottom w:w="65" w:type="dxa"/>
+              <w:end w:w="105" w:type="dxa"/>
+            </w:tcMar>
+            <w:tcBorders>
+              <w:bottom w:val="single" w:sz="3" w:color="D9E0E8"/>
+            </w:tcBorders>
+            <w:vAlign w:val="center"/>
+            <w:shd w:val="clear" w:color="auto" w:fill="F4F6FA"/>
           </w:tcPr>
           <w:p>
+            <w:pPr>
+              <w:spacing w:after="0" w:line="240" w:lineRule="auto"/>
+            </w:pPr>
             <w:r>
+              <w:rPr>
+                <w:rFonts w:ascii="Arial" w:hAnsi="Arial" w:cs="Arial" w:eastAsia="Arial"/>
+                <w:b/>
+                <w:color w:val="24364B"/>
+                <w:sz w:val="18"/>
+              </w:rPr>
               <w:t>Directeur de recherche</w:t>
             </w:r>
           </w:p>
         </w:tc>
         <w:tc>
           <w:tcPr>
-            <w:tcW w:type="dxa" w:w="4514"/>
+            <w:tcW w:type="dxa" w:w="4989"/>
+            <w:tcMar>
+              <w:top w:w="65" w:type="dxa"/>
+              <w:start w:w="105" w:type="dxa"/>
+              <w:bottom w:w="65" w:type="dxa"/>
+              <w:end w:w="105" w:type="dxa"/>
+            </w:tcMar>
+            <w:tcBorders>
+              <w:bottom w:val="single" w:sz="3" w:color="D9E0E8"/>
+            </w:tcBorders>
+            <w:vAlign w:val="center"/>
           </w:tcPr>
           <w:p>
+            <w:pPr>
+              <w:spacing w:after="0" w:line="240" w:lineRule="auto"/>
+            </w:pPr>
             <w:r>
+              <w:rPr>
+                <w:rFonts w:ascii="Arial" w:hAnsi="Arial" w:cs="Arial" w:eastAsia="Arial"/>
+                <w:b w:val="0"/>
+                <w:color w:val="172033"/>
+                <w:sz w:val="18"/>
+              </w:rPr>
               <w:t>{{SUPERVISOR}}</w:t>
             </w:r>
           </w:p>
         </w:tc>
       </w:tr>
       <w:tr>
+        <w:trPr>
+          <w:cantSplit/>
+        </w:trPr>
         <w:tc>
           <w:tcPr>
-            <w:tcW w:type="dxa" w:w="4514"/>
+            <w:tcW w:type="dxa" w:w="4989"/>
+            <w:tcMar>
+              <w:top w:w="65" w:type="dxa"/>
+              <w:start w:w="105" w:type="dxa"/>
+              <w:bottom w:w="65" w:type="dxa"/>
+              <w:end w:w="105" w:type="dxa"/>
+            </w:tcMar>
+            <w:tcBorders>
+              <w:bottom w:val="single" w:sz="3" w:color="D9E0E8"/>
+            </w:tcBorders>
+            <w:vAlign w:val="center"/>
+            <w:shd w:val="clear" w:color="auto" w:fill="F4F6FA"/>
           </w:tcPr>
           <w:p>
+            <w:pPr>
+              <w:spacing w:after="0" w:line="240" w:lineRule="auto"/>
+            </w:pPr>
             <w:r>
+              <w:rPr>
+                <w:rFonts w:ascii="Arial" w:hAnsi="Arial" w:cs="Arial" w:eastAsia="Arial"/>
+                <w:b/>
+                <w:color w:val="24364B"/>
+                <w:sz w:val="18"/>
+              </w:rPr>
               <w:t>Email</w:t>
             </w:r>
           </w:p>
         </w:tc>
         <w:tc>
           <w:tcPr>
-            <w:tcW w:type="dxa" w:w="4514"/>
+            <w:tcW w:type="dxa" w:w="4989"/>
+            <w:tcMar>
+              <w:top w:w="65" w:type="dxa"/>
+              <w:start w:w="105" w:type="dxa"/>
+              <w:bottom w:w="65" w:type="dxa"/>
+              <w:end w:w="105" w:type="dxa"/>
+            </w:tcMar>
+            <w:tcBorders>
+              <w:bottom w:val="single" w:sz="3" w:color="D9E0E8"/>
+            </w:tcBorders>
+            <w:vAlign w:val="center"/>
           </w:tcPr>
           <w:p>
+            <w:pPr>
+              <w:spacing w:after="0" w:line="240" w:lineRule="auto"/>
+            </w:pPr>
             <w:r>
+              <w:rPr>
+                <w:rFonts w:ascii="Arial" w:hAnsi="Arial" w:cs="Arial" w:eastAsia="Arial"/>
+                <w:b w:val="0"/>
+                <w:color w:val="172033"/>
+                <w:sz w:val="18"/>
+              </w:rPr>
               <w:t>{{EMAIL}}</w:t>
             </w:r>
           </w:p>
         </w:tc>
       </w:tr>
       <w:tr>
+        <w:trPr>
+          <w:cantSplit/>
+        </w:trPr>
         <w:tc>
           <w:tcPr>
-            <w:tcW w:type="dxa" w:w="4514"/>
+            <w:tcW w:type="dxa" w:w="4989"/>
+            <w:tcMar>
+              <w:top w:w="65" w:type="dxa"/>
+              <w:start w:w="105" w:type="dxa"/>
+              <w:bottom w:w="65" w:type="dxa"/>
+              <w:end w:w="105" w:type="dxa"/>
+            </w:tcMar>
+            <w:tcBorders>
+              <w:bottom w:val="single" w:sz="3" w:color="D9E0E8"/>
+            </w:tcBorders>
+            <w:vAlign w:val="center"/>
+            <w:shd w:val="clear" w:color="auto" w:fill="F4F6FA"/>
           </w:tcPr>
           <w:p>
+            <w:pPr>
+              <w:spacing w:after="0" w:line="240" w:lineRule="auto"/>
+            </w:pPr>
             <w:r>
+              <w:rPr>
+                <w:rFonts w:ascii="Arial" w:hAnsi="Arial" w:cs="Arial" w:eastAsia="Arial"/>
+                <w:b/>
+                <w:color w:val="24364B"/>
+                <w:sz w:val="18"/>
+              </w:rPr>
               <w:t>Téléphone</w:t>
             </w:r>
           </w:p>
         </w:tc>
         <w:tc>
           <w:tcPr>
-            <w:tcW w:type="dxa" w:w="4514"/>
+            <w:tcW w:type="dxa" w:w="4989"/>
+            <w:tcMar>
+              <w:top w:w="65" w:type="dxa"/>
+              <w:start w:w="105" w:type="dxa"/>
+              <w:bottom w:w="65" w:type="dxa"/>
+              <w:end w:w="105" w:type="dxa"/>
+            </w:tcMar>
+            <w:tcBorders>
+              <w:bottom w:val="single" w:sz="3" w:color="D9E0E8"/>
+            </w:tcBorders>
+            <w:vAlign w:val="center"/>
           </w:tcPr>
           <w:p>
+            <w:pPr>
+              <w:spacing w:after="0" w:line="240" w:lineRule="auto"/>
+            </w:pPr>
             <w:r>
+              <w:rPr>
+                <w:rFonts w:ascii="Arial" w:hAnsi="Arial" w:cs="Arial" w:eastAsia="Arial"/>
+                <w:b w:val="0"/>
+                <w:color w:val="172033"/>
+                <w:sz w:val="18"/>
+              </w:rPr>
               <w:t>{{PHONE}}</w:t>
             </w:r>
           </w:p>
@@ -201,149 +723,410 @@
     </w:tbl>
     <w:p>
       <w:pPr>
-        <w:pStyle w:val="Heading2"/>
+        <w:pStyle w:val="Heading1"/>
+        <w:keepNext/>
+        <w:pBdr>
+          <w:bottom w:val="single" w:sz="10" w:space="2" w:color="4F46E5"/>
+        </w:pBdr>
       </w:pPr>
       <w:r>
+        <w:rPr>
+          <w:rFonts w:ascii="Arial" w:hAnsi="Arial" w:cs="Arial" w:eastAsia="Arial"/>
+          <w:b/>
+          <w:color w:val="24364B"/>
+          <w:sz w:val="26"/>
+        </w:rPr>
         <w:t>Service demandé</w:t>
       </w:r>
     </w:p>
     <w:tbl>
       <w:tblPr>
-        <w:tblStyle w:val="LightGrid-Accent1"/>
         <w:tblW w:type="auto" w:w="0"/>
         <w:tblLook w:firstColumn="1" w:firstRow="1" w:lastColumn="0" w:lastRow="0" w:noHBand="0" w:noVBand="1" w:val="04A0"/>
       </w:tblPr>
       <w:tblGrid>
-        <w:gridCol w:w="4514"/>
-        <w:gridCol w:w="4514"/>
+        <w:gridCol w:w="4989"/>
+        <w:gridCol w:w="4989"/>
       </w:tblGrid>
       <w:tr>
+        <w:trPr>
+          <w:cantSplit/>
+        </w:trPr>
         <w:tc>
           <w:tcPr>
-            <w:tcW w:type="dxa" w:w="4514"/>
+            <w:tcW w:type="dxa" w:w="4989"/>
+            <w:tcMar>
+              <w:top w:w="65" w:type="dxa"/>
+              <w:start w:w="105" w:type="dxa"/>
+              <w:bottom w:w="65" w:type="dxa"/>
+              <w:end w:w="105" w:type="dxa"/>
+            </w:tcMar>
+            <w:tcBorders>
+              <w:bottom w:val="single" w:sz="3" w:color="D9E0E8"/>
+            </w:tcBorders>
+            <w:vAlign w:val="center"/>
+            <w:shd w:val="clear" w:color="auto" w:fill="F4F6FA"/>
           </w:tcPr>
           <w:p>
+            <w:pPr>
+              <w:spacing w:after="0" w:line="240" w:lineRule="auto"/>
+            </w:pPr>
             <w:r>
+              <w:rPr>
+                <w:rFonts w:ascii="Arial" w:hAnsi="Arial" w:cs="Arial" w:eastAsia="Arial"/>
+                <w:b/>
+                <w:color w:val="24364B"/>
+                <w:sz w:val="18"/>
+              </w:rPr>
               <w:t>Code</w:t>
             </w:r>
           </w:p>
         </w:tc>
         <w:tc>
           <w:tcPr>
-            <w:tcW w:type="dxa" w:w="4514"/>
+            <w:tcW w:type="dxa" w:w="4989"/>
+            <w:tcMar>
+              <w:top w:w="65" w:type="dxa"/>
+              <w:start w:w="105" w:type="dxa"/>
+              <w:bottom w:w="65" w:type="dxa"/>
+              <w:end w:w="105" w:type="dxa"/>
+            </w:tcMar>
+            <w:tcBorders>
+              <w:bottom w:val="single" w:sz="3" w:color="D9E0E8"/>
+            </w:tcBorders>
+            <w:vAlign w:val="center"/>
           </w:tcPr>
           <w:p>
+            <w:pPr>
+              <w:spacing w:after="0" w:line="240" w:lineRule="auto"/>
+            </w:pPr>
             <w:r>
+              <w:rPr>
+                <w:rFonts w:ascii="Arial" w:hAnsi="Arial" w:cs="Arial" w:eastAsia="Arial"/>
+                <w:b w:val="0"/>
+                <w:color w:val="172033"/>
+                <w:sz w:val="18"/>
+              </w:rPr>
               <w:t>{{SERVICE_CODE}}</w:t>
             </w:r>
           </w:p>
         </w:tc>
       </w:tr>
       <w:tr>
+        <w:trPr>
+          <w:cantSplit/>
+        </w:trPr>
         <w:tc>
           <w:tcPr>
-            <w:tcW w:type="dxa" w:w="4514"/>
+            <w:tcW w:type="dxa" w:w="4989"/>
+            <w:tcMar>
+              <w:top w:w="65" w:type="dxa"/>
+              <w:start w:w="105" w:type="dxa"/>
+              <w:bottom w:w="65" w:type="dxa"/>
+              <w:end w:w="105" w:type="dxa"/>
+            </w:tcMar>
+            <w:tcBorders>
+              <w:bottom w:val="single" w:sz="3" w:color="D9E0E8"/>
+            </w:tcBorders>
+            <w:vAlign w:val="center"/>
+            <w:shd w:val="clear" w:color="auto" w:fill="F4F6FA"/>
           </w:tcPr>
           <w:p>
+            <w:pPr>
+              <w:spacing w:after="0" w:line="240" w:lineRule="auto"/>
+            </w:pPr>
             <w:r>
+              <w:rPr>
+                <w:rFonts w:ascii="Arial" w:hAnsi="Arial" w:cs="Arial" w:eastAsia="Arial"/>
+                <w:b/>
+                <w:color w:val="24364B"/>
+                <w:sz w:val="18"/>
+              </w:rPr>
               <w:t>Intitulé</w:t>
             </w:r>
           </w:p>
         </w:tc>
         <w:tc>
           <w:tcPr>
-            <w:tcW w:type="dxa" w:w="4514"/>
+            <w:tcW w:type="dxa" w:w="4989"/>
+            <w:tcMar>
+              <w:top w:w="65" w:type="dxa"/>
+              <w:start w:w="105" w:type="dxa"/>
+              <w:bottom w:w="65" w:type="dxa"/>
+              <w:end w:w="105" w:type="dxa"/>
+            </w:tcMar>
+            <w:tcBorders>
+              <w:bottom w:val="single" w:sz="3" w:color="D9E0E8"/>
+            </w:tcBorders>
+            <w:vAlign w:val="center"/>
           </w:tcPr>
           <w:p>
+            <w:pPr>
+              <w:spacing w:after="0" w:line="240" w:lineRule="auto"/>
+            </w:pPr>
             <w:r>
+              <w:rPr>
+                <w:rFonts w:ascii="Arial" w:hAnsi="Arial" w:cs="Arial" w:eastAsia="Arial"/>
+                <w:b w:val="0"/>
+                <w:color w:val="172033"/>
+                <w:sz w:val="18"/>
+              </w:rPr>
               <w:t>{{SERVICE_NAME}}</w:t>
             </w:r>
           </w:p>
         </w:tc>
       </w:tr>
       <w:tr>
+        <w:trPr>
+          <w:cantSplit/>
+        </w:trPr>
         <w:tc>
           <w:tcPr>
-            <w:tcW w:type="dxa" w:w="4514"/>
+            <w:tcW w:type="dxa" w:w="4989"/>
+            <w:tcMar>
+              <w:top w:w="65" w:type="dxa"/>
+              <w:start w:w="105" w:type="dxa"/>
+              <w:bottom w:w="65" w:type="dxa"/>
+              <w:end w:w="105" w:type="dxa"/>
+            </w:tcMar>
+            <w:tcBorders>
+              <w:bottom w:val="single" w:sz="3" w:color="D9E0E8"/>
+            </w:tcBorders>
+            <w:vAlign w:val="center"/>
+            <w:shd w:val="clear" w:color="auto" w:fill="F4F6FA"/>
           </w:tcPr>
           <w:p>
+            <w:pPr>
+              <w:spacing w:after="0" w:line="240" w:lineRule="auto"/>
+            </w:pPr>
             <w:r>
+              <w:rPr>
+                <w:rFonts w:ascii="Arial" w:hAnsi="Arial" w:cs="Arial" w:eastAsia="Arial"/>
+                <w:b/>
+                <w:color w:val="24364B"/>
+                <w:sz w:val="18"/>
+              </w:rPr>
               <w:t>Description</w:t>
             </w:r>
           </w:p>
         </w:tc>
         <w:tc>
           <w:tcPr>
-            <w:tcW w:type="dxa" w:w="4514"/>
+            <w:tcW w:type="dxa" w:w="4989"/>
+            <w:tcMar>
+              <w:top w:w="65" w:type="dxa"/>
+              <w:start w:w="105" w:type="dxa"/>
+              <w:bottom w:w="65" w:type="dxa"/>
+              <w:end w:w="105" w:type="dxa"/>
+            </w:tcMar>
+            <w:tcBorders>
+              <w:bottom w:val="single" w:sz="3" w:color="D9E0E8"/>
+            </w:tcBorders>
+            <w:vAlign w:val="center"/>
           </w:tcPr>
           <w:p>
+            <w:pPr>
+              <w:spacing w:after="0" w:line="240" w:lineRule="auto"/>
+            </w:pPr>
             <w:r>
+              <w:rPr>
+                <w:rFonts w:ascii="Arial" w:hAnsi="Arial" w:cs="Arial" w:eastAsia="Arial"/>
+                <w:b w:val="0"/>
+                <w:color w:val="172033"/>
+                <w:sz w:val="18"/>
+              </w:rPr>
               <w:t>{{SERVICE_DESCRIPTION}}</w:t>
             </w:r>
           </w:p>
         </w:tc>
       </w:tr>
       <w:tr>
+        <w:trPr>
+          <w:cantSplit/>
+        </w:trPr>
         <w:tc>
           <w:tcPr>
-            <w:tcW w:type="dxa" w:w="4514"/>
+            <w:tcW w:type="dxa" w:w="4989"/>
+            <w:tcMar>
+              <w:top w:w="65" w:type="dxa"/>
+              <w:start w:w="105" w:type="dxa"/>
+              <w:bottom w:w="65" w:type="dxa"/>
+              <w:end w:w="105" w:type="dxa"/>
+            </w:tcMar>
+            <w:tcBorders>
+              <w:bottom w:val="single" w:sz="3" w:color="D9E0E8"/>
+            </w:tcBorders>
+            <w:vAlign w:val="center"/>
+            <w:shd w:val="clear" w:color="auto" w:fill="F4F6FA"/>
           </w:tcPr>
           <w:p>
+            <w:pPr>
+              <w:spacing w:after="0" w:line="240" w:lineRule="auto"/>
+            </w:pPr>
             <w:r>
+              <w:rPr>
+                <w:rFonts w:ascii="Arial" w:hAnsi="Arial" w:cs="Arial" w:eastAsia="Arial"/>
+                <w:b/>
+                <w:color w:val="24364B"/>
+                <w:sz w:val="18"/>
+              </w:rPr>
               <w:t>Délai (jours ouvrables)</w:t>
             </w:r>
           </w:p>
         </w:tc>
         <w:tc>
           <w:tcPr>
-            <w:tcW w:type="dxa" w:w="4514"/>
+            <w:tcW w:type="dxa" w:w="4989"/>
+            <w:tcMar>
+              <w:top w:w="65" w:type="dxa"/>
+              <w:start w:w="105" w:type="dxa"/>
+              <w:bottom w:w="65" w:type="dxa"/>
+              <w:end w:w="105" w:type="dxa"/>
+            </w:tcMar>
+            <w:tcBorders>
+              <w:bottom w:val="single" w:sz="3" w:color="D9E0E8"/>
+            </w:tcBorders>
+            <w:vAlign w:val="center"/>
           </w:tcPr>
           <w:p>
+            <w:pPr>
+              <w:spacing w:after="0" w:line="240" w:lineRule="auto"/>
+            </w:pPr>
             <w:r>
+              <w:rPr>
+                <w:rFonts w:ascii="Arial" w:hAnsi="Arial" w:cs="Arial" w:eastAsia="Arial"/>
+                <w:b w:val="0"/>
+                <w:color w:val="172033"/>
+                <w:sz w:val="18"/>
+              </w:rPr>
               <w:t>{{SERVICE_TURNAROUND}}</w:t>
             </w:r>
           </w:p>
         </w:tc>
       </w:tr>
       <w:tr>
+        <w:trPr>
+          <w:cantSplit/>
+        </w:trPr>
         <w:tc>
           <w:tcPr>
-            <w:tcW w:type="dxa" w:w="4514"/>
+            <w:tcW w:type="dxa" w:w="4989"/>
+            <w:tcMar>
+              <w:top w:w="65" w:type="dxa"/>
+              <w:start w:w="105" w:type="dxa"/>
+              <w:bottom w:w="65" w:type="dxa"/>
+              <w:end w:w="105" w:type="dxa"/>
+            </w:tcMar>
+            <w:tcBorders>
+              <w:bottom w:val="single" w:sz="3" w:color="D9E0E8"/>
+            </w:tcBorders>
+            <w:vAlign w:val="center"/>
+            <w:shd w:val="clear" w:color="auto" w:fill="F4F6FA"/>
           </w:tcPr>
           <w:p>
+            <w:pPr>
+              <w:spacing w:after="0" w:line="240" w:lineRule="auto"/>
+            </w:pPr>
             <w:r>
+              <w:rPr>
+                <w:rFonts w:ascii="Arial" w:hAnsi="Arial" w:cs="Arial" w:eastAsia="Arial"/>
+                <w:b/>
+                <w:color w:val="24364B"/>
+                <w:sz w:val="18"/>
+              </w:rPr>
               <w:t>Canal</w:t>
             </w:r>
           </w:p>
         </w:tc>
         <w:tc>
           <w:tcPr>
-            <w:tcW w:type="dxa" w:w="4514"/>
+            <w:tcW w:type="dxa" w:w="4989"/>
+            <w:tcMar>
+              <w:top w:w="65" w:type="dxa"/>
+              <w:start w:w="105" w:type="dxa"/>
+              <w:bottom w:w="65" w:type="dxa"/>
+              <w:end w:w="105" w:type="dxa"/>
+            </w:tcMar>
+            <w:tcBorders>
+              <w:bottom w:val="single" w:sz="3" w:color="D9E0E8"/>
+            </w:tcBorders>
+            <w:vAlign w:val="center"/>
           </w:tcPr>
           <w:p>
+            <w:pPr>
+              <w:spacing w:after="0" w:line="240" w:lineRule="auto"/>
+            </w:pPr>
             <w:r>
+              <w:rPr>
+                <w:rFonts w:ascii="Arial" w:hAnsi="Arial" w:cs="Arial" w:eastAsia="Arial"/>
+                <w:b w:val="0"/>
+                <w:color w:val="172033"/>
+                <w:sz w:val="18"/>
+              </w:rPr>
               <w:t>{{CHANNEL}}</w:t>
             </w:r>
           </w:p>
         </w:tc>
       </w:tr>
       <w:tr>
+        <w:trPr>
+          <w:cantSplit/>
+        </w:trPr>
         <w:tc>
           <w:tcPr>
-            <w:tcW w:type="dxa" w:w="4514"/>
+            <w:tcW w:type="dxa" w:w="4989"/>
+            <w:tcMar>
+              <w:top w:w="65" w:type="dxa"/>
+              <w:start w:w="105" w:type="dxa"/>
+              <w:bottom w:w="65" w:type="dxa"/>
+              <w:end w:w="105" w:type="dxa"/>
+            </w:tcMar>
+            <w:tcBorders>
+              <w:bottom w:val="single" w:sz="3" w:color="D9E0E8"/>
+            </w:tcBorders>
+            <w:vAlign w:val="center"/>
+            <w:shd w:val="clear" w:color="auto" w:fill="F4F6FA"/>
           </w:tcPr>
           <w:p>
+            <w:pPr>
+              <w:spacing w:after="0" w:line="240" w:lineRule="auto"/>
+            </w:pPr>
             <w:r>
+              <w:rPr>
+                <w:rFonts w:ascii="Arial" w:hAnsi="Arial" w:cs="Arial" w:eastAsia="Arial"/>
+                <w:b/>
+                <w:color w:val="24364B"/>
+                <w:sz w:val="18"/>
+              </w:rPr>
               <w:t>Urgence</w:t>
             </w:r>
           </w:p>
         </w:tc>
         <w:tc>
           <w:tcPr>
-            <w:tcW w:type="dxa" w:w="4514"/>
+            <w:tcW w:type="dxa" w:w="4989"/>
+            <w:tcMar>
+              <w:top w:w="65" w:type="dxa"/>
+              <w:start w:w="105" w:type="dxa"/>
+              <w:bottom w:w="65" w:type="dxa"/>
+              <w:end w:w="105" w:type="dxa"/>
+            </w:tcMar>
+            <w:tcBorders>
+              <w:bottom w:val="single" w:sz="3" w:color="D9E0E8"/>
+            </w:tcBorders>
+            <w:vAlign w:val="center"/>
           </w:tcPr>
           <w:p>
+            <w:pPr>
+              <w:spacing w:after="0" w:line="240" w:lineRule="auto"/>
+            </w:pPr>
             <w:r>
+              <w:rPr>
+                <w:rFonts w:ascii="Arial" w:hAnsi="Arial" w:cs="Arial" w:eastAsia="Arial"/>
+                <w:b w:val="0"/>
+                <w:color w:val="172033"/>
+                <w:sz w:val="18"/>
+              </w:rPr>
               <w:t>{{URGENCY}}</w:t>
             </w:r>
           </w:p>
@@ -352,83 +1135,733 @@
     </w:tbl>
     <w:p>
       <w:pPr>
-        <w:pStyle w:val="Heading2"/>
+        <w:pStyle w:val="Heading1"/>
+        <w:keepNext/>
+        <w:pBdr>
+          <w:bottom w:val="single" w:sz="10" w:space="2" w:color="4F46E5"/>
+        </w:pBdr>
       </w:pPr>
       <w:r>
+        <w:rPr>
+          <w:rFonts w:ascii="Arial" w:hAnsi="Arial" w:cs="Arial" w:eastAsia="Arial"/>
+          <w:b/>
+          <w:color w:val="24364B"/>
+          <w:sz w:val="26"/>
+        </w:rPr>
         <w:t>Détails de la demande</w:t>
       </w:r>
     </w:p>
-    <w:p>
-      <w:r>
-        <w:t>Titre : {{TITLE}}</w:t>
-      </w:r>
-    </w:p>
-    <w:p>
-      <w:r>
-        <w:t>Description : {{DESCRIPTION}}</w:t>
-      </w:r>
-    </w:p>
-    <w:p>
-      <w:r>
-        <w:t>Paramètres : {{SERVICE_PARAMS}}</w:t>
-      </w:r>
-    </w:p>
-    <w:p>
-      <w:r>
-        <w:t>Échantillons : {{SAMPLE_SUMMARY}}</w:t>
-      </w:r>
-    </w:p>
+    <w:tbl>
+      <w:tblPr>
+        <w:tblW w:type="auto" w:w="0"/>
+        <w:tblLook w:firstColumn="1" w:firstRow="1" w:lastColumn="0" w:lastRow="0" w:noHBand="0" w:noVBand="1" w:val="04A0"/>
+      </w:tblPr>
+      <w:tblGrid>
+        <w:gridCol w:w="4989"/>
+        <w:gridCol w:w="4989"/>
+      </w:tblGrid>
+      <w:tr>
+        <w:trPr>
+          <w:cantSplit/>
+        </w:trPr>
+        <w:tc>
+          <w:tcPr>
+            <w:tcW w:type="dxa" w:w="4989"/>
+            <w:tcMar>
+              <w:top w:w="65" w:type="dxa"/>
+              <w:start w:w="105" w:type="dxa"/>
+              <w:bottom w:w="65" w:type="dxa"/>
+              <w:end w:w="105" w:type="dxa"/>
+            </w:tcMar>
+            <w:tcBorders>
+              <w:bottom w:val="single" w:sz="3" w:color="D9E0E8"/>
+            </w:tcBorders>
+            <w:vAlign w:val="center"/>
+            <w:shd w:val="clear" w:color="auto" w:fill="F4F6FA"/>
+          </w:tcPr>
+          <w:p>
+            <w:pPr>
+              <w:spacing w:after="0" w:line="240" w:lineRule="auto"/>
+            </w:pPr>
+            <w:r>
+              <w:rPr>
+                <w:rFonts w:ascii="Arial" w:hAnsi="Arial" w:cs="Arial" w:eastAsia="Arial"/>
+                <w:b/>
+                <w:color w:val="24364B"/>
+                <w:sz w:val="18"/>
+              </w:rPr>
+              <w:t>Titre</w:t>
+            </w:r>
+          </w:p>
+        </w:tc>
+        <w:tc>
+          <w:tcPr>
+            <w:tcW w:type="dxa" w:w="4989"/>
+            <w:tcMar>
+              <w:top w:w="65" w:type="dxa"/>
+              <w:start w:w="105" w:type="dxa"/>
+              <w:bottom w:w="65" w:type="dxa"/>
+              <w:end w:w="105" w:type="dxa"/>
+            </w:tcMar>
+            <w:tcBorders>
+              <w:bottom w:val="single" w:sz="3" w:color="D9E0E8"/>
+            </w:tcBorders>
+            <w:vAlign w:val="center"/>
+          </w:tcPr>
+          <w:p>
+            <w:pPr>
+              <w:spacing w:after="0" w:line="240" w:lineRule="auto"/>
+            </w:pPr>
+            <w:r>
+              <w:rPr>
+                <w:rFonts w:ascii="Arial" w:hAnsi="Arial" w:cs="Arial" w:eastAsia="Arial"/>
+                <w:b w:val="0"/>
+                <w:color w:val="172033"/>
+                <w:sz w:val="18"/>
+              </w:rPr>
+              <w:t>{{TITLE}}</w:t>
+            </w:r>
+          </w:p>
+        </w:tc>
+      </w:tr>
+      <w:tr>
+        <w:trPr>
+          <w:cantSplit/>
+        </w:trPr>
+        <w:tc>
+          <w:tcPr>
+            <w:tcW w:type="dxa" w:w="4989"/>
+            <w:tcMar>
+              <w:top w:w="65" w:type="dxa"/>
+              <w:start w:w="105" w:type="dxa"/>
+              <w:bottom w:w="65" w:type="dxa"/>
+              <w:end w:w="105" w:type="dxa"/>
+            </w:tcMar>
+            <w:tcBorders>
+              <w:bottom w:val="single" w:sz="3" w:color="D9E0E8"/>
+            </w:tcBorders>
+            <w:vAlign w:val="center"/>
+            <w:shd w:val="clear" w:color="auto" w:fill="F4F6FA"/>
+          </w:tcPr>
+          <w:p>
+            <w:pPr>
+              <w:spacing w:after="0" w:line="240" w:lineRule="auto"/>
+            </w:pPr>
+            <w:r>
+              <w:rPr>
+                <w:rFonts w:ascii="Arial" w:hAnsi="Arial" w:cs="Arial" w:eastAsia="Arial"/>
+                <w:b/>
+                <w:color w:val="24364B"/>
+                <w:sz w:val="18"/>
+              </w:rPr>
+              <w:t>Description</w:t>
+            </w:r>
+          </w:p>
+        </w:tc>
+        <w:tc>
+          <w:tcPr>
+            <w:tcW w:type="dxa" w:w="4989"/>
+            <w:tcMar>
+              <w:top w:w="65" w:type="dxa"/>
+              <w:start w:w="105" w:type="dxa"/>
+              <w:bottom w:w="65" w:type="dxa"/>
+              <w:end w:w="105" w:type="dxa"/>
+            </w:tcMar>
+            <w:tcBorders>
+              <w:bottom w:val="single" w:sz="3" w:color="D9E0E8"/>
+            </w:tcBorders>
+            <w:vAlign w:val="center"/>
+          </w:tcPr>
+          <w:p>
+            <w:pPr>
+              <w:spacing w:after="0" w:line="240" w:lineRule="auto"/>
+            </w:pPr>
+            <w:r>
+              <w:rPr>
+                <w:rFonts w:ascii="Arial" w:hAnsi="Arial" w:cs="Arial" w:eastAsia="Arial"/>
+                <w:b w:val="0"/>
+                <w:color w:val="172033"/>
+                <w:sz w:val="18"/>
+              </w:rPr>
+              <w:t>{{DESCRIPTION}}</w:t>
+            </w:r>
+          </w:p>
+        </w:tc>
+      </w:tr>
+      <w:tr>
+        <w:trPr>
+          <w:cantSplit/>
+        </w:trPr>
+        <w:tc>
+          <w:tcPr>
+            <w:tcW w:type="dxa" w:w="4989"/>
+            <w:tcMar>
+              <w:top w:w="65" w:type="dxa"/>
+              <w:start w:w="105" w:type="dxa"/>
+              <w:bottom w:w="65" w:type="dxa"/>
+              <w:end w:w="105" w:type="dxa"/>
+            </w:tcMar>
+            <w:tcBorders>
+              <w:bottom w:val="single" w:sz="3" w:color="D9E0E8"/>
+            </w:tcBorders>
+            <w:vAlign w:val="center"/>
+            <w:shd w:val="clear" w:color="auto" w:fill="F4F6FA"/>
+          </w:tcPr>
+          <w:p>
+            <w:pPr>
+              <w:spacing w:after="0" w:line="240" w:lineRule="auto"/>
+            </w:pPr>
+            <w:r>
+              <w:rPr>
+                <w:rFonts w:ascii="Arial" w:hAnsi="Arial" w:cs="Arial" w:eastAsia="Arial"/>
+                <w:b/>
+                <w:color w:val="24364B"/>
+                <w:sz w:val="18"/>
+              </w:rPr>
+              <w:t>Paramètres</w:t>
+            </w:r>
+          </w:p>
+        </w:tc>
+        <w:tc>
+          <w:tcPr>
+            <w:tcW w:type="dxa" w:w="4989"/>
+            <w:tcMar>
+              <w:top w:w="65" w:type="dxa"/>
+              <w:start w:w="105" w:type="dxa"/>
+              <w:bottom w:w="65" w:type="dxa"/>
+              <w:end w:w="105" w:type="dxa"/>
+            </w:tcMar>
+            <w:tcBorders>
+              <w:bottom w:val="single" w:sz="3" w:color="D9E0E8"/>
+            </w:tcBorders>
+            <w:vAlign w:val="center"/>
+          </w:tcPr>
+          <w:p>
+            <w:pPr>
+              <w:spacing w:after="0" w:line="240" w:lineRule="auto"/>
+            </w:pPr>
+            <w:r>
+              <w:rPr>
+                <w:rFonts w:ascii="Arial" w:hAnsi="Arial" w:cs="Arial" w:eastAsia="Arial"/>
+                <w:b w:val="0"/>
+                <w:color w:val="172033"/>
+                <w:sz w:val="18"/>
+              </w:rPr>
+              <w:t>{{SERVICE_PARAMS}}</w:t>
+            </w:r>
+          </w:p>
+        </w:tc>
+      </w:tr>
+      <w:tr>
+        <w:trPr>
+          <w:cantSplit/>
+        </w:trPr>
+        <w:tc>
+          <w:tcPr>
+            <w:tcW w:type="dxa" w:w="4989"/>
+            <w:tcMar>
+              <w:top w:w="65" w:type="dxa"/>
+              <w:start w:w="105" w:type="dxa"/>
+              <w:bottom w:w="65" w:type="dxa"/>
+              <w:end w:w="105" w:type="dxa"/>
+            </w:tcMar>
+            <w:tcBorders>
+              <w:bottom w:val="single" w:sz="3" w:color="D9E0E8"/>
+            </w:tcBorders>
+            <w:vAlign w:val="center"/>
+            <w:shd w:val="clear" w:color="auto" w:fill="F4F6FA"/>
+          </w:tcPr>
+          <w:p>
+            <w:pPr>
+              <w:spacing w:after="0" w:line="240" w:lineRule="auto"/>
+            </w:pPr>
+            <w:r>
+              <w:rPr>
+                <w:rFonts w:ascii="Arial" w:hAnsi="Arial" w:cs="Arial" w:eastAsia="Arial"/>
+                <w:b/>
+                <w:color w:val="24364B"/>
+                <w:sz w:val="18"/>
+              </w:rPr>
+              <w:t>Échantillons</w:t>
+            </w:r>
+          </w:p>
+        </w:tc>
+        <w:tc>
+          <w:tcPr>
+            <w:tcW w:type="dxa" w:w="4989"/>
+            <w:tcMar>
+              <w:top w:w="65" w:type="dxa"/>
+              <w:start w:w="105" w:type="dxa"/>
+              <w:bottom w:w="65" w:type="dxa"/>
+              <w:end w:w="105" w:type="dxa"/>
+            </w:tcMar>
+            <w:tcBorders>
+              <w:bottom w:val="single" w:sz="3" w:color="D9E0E8"/>
+            </w:tcBorders>
+            <w:vAlign w:val="center"/>
+          </w:tcPr>
+          <w:p>
+            <w:pPr>
+              <w:spacing w:after="0" w:line="240" w:lineRule="auto"/>
+            </w:pPr>
+            <w:r>
+              <w:rPr>
+                <w:rFonts w:ascii="Arial" w:hAnsi="Arial" w:cs="Arial" w:eastAsia="Arial"/>
+                <w:b w:val="0"/>
+                <w:color w:val="172033"/>
+                <w:sz w:val="18"/>
+              </w:rPr>
+              <w:t>{{SAMPLE_SUMMARY}}</w:t>
+            </w:r>
+          </w:p>
+        </w:tc>
+      </w:tr>
+    </w:tbl>
     <w:p>
       <w:pPr>
-        <w:pStyle w:val="Heading2"/>
+        <w:pStyle w:val="Heading1"/>
+        <w:keepNext/>
+        <w:pBdr>
+          <w:bottom w:val="single" w:sz="10" w:space="2" w:color="4F46E5"/>
+        </w:pBdr>
       </w:pPr>
       <w:r>
+        <w:rPr>
+          <w:rFonts w:ascii="Arial" w:hAnsi="Arial" w:cs="Arial" w:eastAsia="Arial"/>
+          <w:b/>
+          <w:color w:val="24364B"/>
+          <w:sz w:val="26"/>
+        </w:rPr>
         <w:t>Décompte budgétaire IBTIKAR</w:t>
       </w:r>
     </w:p>
-    <w:p>
-      <w:r>
-        <w:t>Budget annuel par étudiant : 200 000 DA</w:t>
-      </w:r>
-    </w:p>
-    <w:p>
-      <w:r>
-        <w:t>Montant de cette prestation : {{BUDGET_AMOUNT}}</w:t>
-      </w:r>
-    </w:p>
-    <w:p>
-      <w:r>
-        <w:t>Solde IBTIKAR déclaré : {{IBTIKAR_BALANCE}}</w:t>
-      </w:r>
-    </w:p>
+    <w:tbl>
+      <w:tblPr>
+        <w:tblW w:type="auto" w:w="0"/>
+        <w:tblLook w:firstColumn="1" w:firstRow="1" w:lastColumn="0" w:lastRow="0" w:noHBand="0" w:noVBand="1" w:val="04A0"/>
+      </w:tblPr>
+      <w:tblGrid>
+        <w:gridCol w:w="4989"/>
+        <w:gridCol w:w="4989"/>
+      </w:tblGrid>
+      <w:tr>
+        <w:trPr>
+          <w:cantSplit/>
+        </w:trPr>
+        <w:tc>
+          <w:tcPr>
+            <w:tcW w:type="dxa" w:w="4989"/>
+            <w:tcMar>
+              <w:top w:w="65" w:type="dxa"/>
+              <w:start w:w="105" w:type="dxa"/>
+              <w:bottom w:w="65" w:type="dxa"/>
+              <w:end w:w="105" w:type="dxa"/>
+            </w:tcMar>
+            <w:tcBorders>
+              <w:bottom w:val="single" w:sz="3" w:color="D9E0E8"/>
+            </w:tcBorders>
+            <w:vAlign w:val="center"/>
+            <w:shd w:val="clear" w:color="auto" w:fill="F4F6FA"/>
+          </w:tcPr>
+          <w:p>
+            <w:pPr>
+              <w:spacing w:after="0" w:line="240" w:lineRule="auto"/>
+            </w:pPr>
+            <w:r>
+              <w:rPr>
+                <w:rFonts w:ascii="Arial" w:hAnsi="Arial" w:cs="Arial" w:eastAsia="Arial"/>
+                <w:b/>
+                <w:color w:val="24364B"/>
+                <w:sz w:val="18"/>
+              </w:rPr>
+              <w:t>Budget annuel par étudiant</w:t>
+            </w:r>
+          </w:p>
+        </w:tc>
+        <w:tc>
+          <w:tcPr>
+            <w:tcW w:type="dxa" w:w="4989"/>
+            <w:tcMar>
+              <w:top w:w="65" w:type="dxa"/>
+              <w:start w:w="105" w:type="dxa"/>
+              <w:bottom w:w="65" w:type="dxa"/>
+              <w:end w:w="105" w:type="dxa"/>
+            </w:tcMar>
+            <w:tcBorders>
+              <w:bottom w:val="single" w:sz="3" w:color="D9E0E8"/>
+            </w:tcBorders>
+            <w:vAlign w:val="center"/>
+          </w:tcPr>
+          <w:p>
+            <w:pPr>
+              <w:spacing w:after="0" w:line="240" w:lineRule="auto"/>
+            </w:pPr>
+            <w:r>
+              <w:rPr>
+                <w:rFonts w:ascii="Arial" w:hAnsi="Arial" w:cs="Arial" w:eastAsia="Arial"/>
+                <w:b w:val="0"/>
+                <w:color w:val="172033"/>
+                <w:sz w:val="18"/>
+              </w:rPr>
+              <w:t>200 000 DA</w:t>
+            </w:r>
+          </w:p>
+        </w:tc>
+      </w:tr>
+      <w:tr>
+        <w:trPr>
+          <w:cantSplit/>
+        </w:trPr>
+        <w:tc>
+          <w:tcPr>
+            <w:tcW w:type="dxa" w:w="4989"/>
+            <w:tcMar>
+              <w:top w:w="65" w:type="dxa"/>
+              <w:start w:w="105" w:type="dxa"/>
+              <w:bottom w:w="65" w:type="dxa"/>
+              <w:end w:w="105" w:type="dxa"/>
+            </w:tcMar>
+            <w:tcBorders>
+              <w:bottom w:val="single" w:sz="3" w:color="D9E0E8"/>
+            </w:tcBorders>
+            <w:vAlign w:val="center"/>
+            <w:shd w:val="clear" w:color="auto" w:fill="F4F6FA"/>
+          </w:tcPr>
+          <w:p>
+            <w:pPr>
+              <w:spacing w:after="0" w:line="240" w:lineRule="auto"/>
+            </w:pPr>
+            <w:r>
+              <w:rPr>
+                <w:rFonts w:ascii="Arial" w:hAnsi="Arial" w:cs="Arial" w:eastAsia="Arial"/>
+                <w:b/>
+                <w:color w:val="24364B"/>
+                <w:sz w:val="18"/>
+              </w:rPr>
+              <w:t>Montant de cette prestation</w:t>
+            </w:r>
+          </w:p>
+        </w:tc>
+        <w:tc>
+          <w:tcPr>
+            <w:tcW w:type="dxa" w:w="4989"/>
+            <w:tcMar>
+              <w:top w:w="65" w:type="dxa"/>
+              <w:start w:w="105" w:type="dxa"/>
+              <w:bottom w:w="65" w:type="dxa"/>
+              <w:end w:w="105" w:type="dxa"/>
+            </w:tcMar>
+            <w:tcBorders>
+              <w:bottom w:val="single" w:sz="3" w:color="D9E0E8"/>
+            </w:tcBorders>
+            <w:vAlign w:val="center"/>
+          </w:tcPr>
+          <w:p>
+            <w:pPr>
+              <w:spacing w:after="0" w:line="240" w:lineRule="auto"/>
+            </w:pPr>
+            <w:r>
+              <w:rPr>
+                <w:rFonts w:ascii="Arial" w:hAnsi="Arial" w:cs="Arial" w:eastAsia="Arial"/>
+                <w:b w:val="0"/>
+                <w:color w:val="172033"/>
+                <w:sz w:val="18"/>
+              </w:rPr>
+              <w:t>{{BUDGET_AMOUNT}}</w:t>
+            </w:r>
+          </w:p>
+        </w:tc>
+      </w:tr>
+      <w:tr>
+        <w:trPr>
+          <w:cantSplit/>
+        </w:trPr>
+        <w:tc>
+          <w:tcPr>
+            <w:tcW w:type="dxa" w:w="4989"/>
+            <w:tcMar>
+              <w:top w:w="65" w:type="dxa"/>
+              <w:start w:w="105" w:type="dxa"/>
+              <w:bottom w:w="65" w:type="dxa"/>
+              <w:end w:w="105" w:type="dxa"/>
+            </w:tcMar>
+            <w:tcBorders>
+              <w:bottom w:val="single" w:sz="3" w:color="D9E0E8"/>
+            </w:tcBorders>
+            <w:vAlign w:val="center"/>
+            <w:shd w:val="clear" w:color="auto" w:fill="F4F6FA"/>
+          </w:tcPr>
+          <w:p>
+            <w:pPr>
+              <w:spacing w:after="0" w:line="240" w:lineRule="auto"/>
+            </w:pPr>
+            <w:r>
+              <w:rPr>
+                <w:rFonts w:ascii="Arial" w:hAnsi="Arial" w:cs="Arial" w:eastAsia="Arial"/>
+                <w:b/>
+                <w:color w:val="24364B"/>
+                <w:sz w:val="18"/>
+              </w:rPr>
+              <w:t>Solde IBTIKAR déclaré</w:t>
+            </w:r>
+          </w:p>
+        </w:tc>
+        <w:tc>
+          <w:tcPr>
+            <w:tcW w:type="dxa" w:w="4989"/>
+            <w:tcMar>
+              <w:top w:w="65" w:type="dxa"/>
+              <w:start w:w="105" w:type="dxa"/>
+              <w:bottom w:w="65" w:type="dxa"/>
+              <w:end w:w="105" w:type="dxa"/>
+            </w:tcMar>
+            <w:tcBorders>
+              <w:bottom w:val="single" w:sz="3" w:color="D9E0E8"/>
+            </w:tcBorders>
+            <w:vAlign w:val="center"/>
+          </w:tcPr>
+          <w:p>
+            <w:pPr>
+              <w:spacing w:after="0" w:line="240" w:lineRule="auto"/>
+            </w:pPr>
+            <w:r>
+              <w:rPr>
+                <w:rFonts w:ascii="Arial" w:hAnsi="Arial" w:cs="Arial" w:eastAsia="Arial"/>
+                <w:b w:val="0"/>
+                <w:color w:val="172033"/>
+                <w:sz w:val="18"/>
+              </w:rPr>
+              <w:t>{{IBTIKAR_BALANCE}}</w:t>
+            </w:r>
+          </w:p>
+        </w:tc>
+      </w:tr>
+    </w:tbl>
     <w:p>
       <w:pPr>
-        <w:pStyle w:val="Heading2"/>
+        <w:pStyle w:val="Heading1"/>
+        <w:keepNext/>
+        <w:pBdr>
+          <w:bottom w:val="single" w:sz="10" w:space="2" w:color="4F46E5"/>
+        </w:pBdr>
       </w:pPr>
       <w:r>
+        <w:rPr>
+          <w:rFonts w:ascii="Arial" w:hAnsi="Arial" w:cs="Arial" w:eastAsia="Arial"/>
+          <w:b/>
+          <w:color w:val="24364B"/>
+          <w:sz w:val="26"/>
+        </w:rPr>
         <w:t>Assignation</w:t>
       </w:r>
     </w:p>
-    <w:p>
-      <w:r>
-        <w:t>Analyste : {{ASSIGNED_ANALYST}}</w:t>
-      </w:r>
-    </w:p>
-    <w:p>
-      <w:r>
-        <w:t>Email analyste : {{ANALYST_EMAIL}}</w:t>
-      </w:r>
-    </w:p>
-    <w:p>
-      <w:r>
-        <w:t>Rendez-vous : {{APPOINTMENT_DATE}}</w:t>
-      </w:r>
-    </w:p>
+    <w:tbl>
+      <w:tblPr>
+        <w:tblW w:type="auto" w:w="0"/>
+        <w:tblLook w:firstColumn="1" w:firstRow="1" w:lastColumn="0" w:lastRow="0" w:noHBand="0" w:noVBand="1" w:val="04A0"/>
+      </w:tblPr>
+      <w:tblGrid>
+        <w:gridCol w:w="4989"/>
+        <w:gridCol w:w="4989"/>
+      </w:tblGrid>
+      <w:tr>
+        <w:trPr>
+          <w:cantSplit/>
+        </w:trPr>
+        <w:tc>
+          <w:tcPr>
+            <w:tcW w:type="dxa" w:w="4989"/>
+            <w:tcMar>
+              <w:top w:w="65" w:type="dxa"/>
+              <w:start w:w="105" w:type="dxa"/>
+              <w:bottom w:w="65" w:type="dxa"/>
+              <w:end w:w="105" w:type="dxa"/>
+            </w:tcMar>
+            <w:tcBorders>
+              <w:bottom w:val="single" w:sz="3" w:color="D9E0E8"/>
+            </w:tcBorders>
+            <w:vAlign w:val="center"/>
+            <w:shd w:val="clear" w:color="auto" w:fill="F4F6FA"/>
+          </w:tcPr>
+          <w:p>
+            <w:pPr>
+              <w:spacing w:after="0" w:line="240" w:lineRule="auto"/>
+            </w:pPr>
+            <w:r>
+              <w:rPr>
+                <w:rFonts w:ascii="Arial" w:hAnsi="Arial" w:cs="Arial" w:eastAsia="Arial"/>
+                <w:b/>
+                <w:color w:val="24364B"/>
+                <w:sz w:val="18"/>
+              </w:rPr>
+              <w:t>Analyste</w:t>
+            </w:r>
+          </w:p>
+        </w:tc>
+        <w:tc>
+          <w:tcPr>
+            <w:tcW w:type="dxa" w:w="4989"/>
+            <w:tcMar>
+              <w:top w:w="65" w:type="dxa"/>
+              <w:start w:w="105" w:type="dxa"/>
+              <w:bottom w:w="65" w:type="dxa"/>
+              <w:end w:w="105" w:type="dxa"/>
+            </w:tcMar>
+            <w:tcBorders>
+              <w:bottom w:val="single" w:sz="3" w:color="D9E0E8"/>
+            </w:tcBorders>
+            <w:vAlign w:val="center"/>
+          </w:tcPr>
+          <w:p>
+            <w:pPr>
+              <w:spacing w:after="0" w:line="240" w:lineRule="auto"/>
+            </w:pPr>
+            <w:r>
+              <w:rPr>
+                <w:rFonts w:ascii="Arial" w:hAnsi="Arial" w:cs="Arial" w:eastAsia="Arial"/>
+                <w:b w:val="0"/>
+                <w:color w:val="172033"/>
+                <w:sz w:val="18"/>
+              </w:rPr>
+              <w:t>{{ASSIGNED_ANALYST}}</w:t>
+            </w:r>
+          </w:p>
+        </w:tc>
+      </w:tr>
+      <w:tr>
+        <w:trPr>
+          <w:cantSplit/>
+        </w:trPr>
+        <w:tc>
+          <w:tcPr>
+            <w:tcW w:type="dxa" w:w="4989"/>
+            <w:tcMar>
+              <w:top w:w="65" w:type="dxa"/>
+              <w:start w:w="105" w:type="dxa"/>
+              <w:bottom w:w="65" w:type="dxa"/>
+              <w:end w:w="105" w:type="dxa"/>
+            </w:tcMar>
+            <w:tcBorders>
+              <w:bottom w:val="single" w:sz="3" w:color="D9E0E8"/>
+            </w:tcBorders>
+            <w:vAlign w:val="center"/>
+            <w:shd w:val="clear" w:color="auto" w:fill="F4F6FA"/>
+          </w:tcPr>
+          <w:p>
+            <w:pPr>
+              <w:spacing w:after="0" w:line="240" w:lineRule="auto"/>
+            </w:pPr>
+            <w:r>
+              <w:rPr>
+                <w:rFonts w:ascii="Arial" w:hAnsi="Arial" w:cs="Arial" w:eastAsia="Arial"/>
+                <w:b/>
+                <w:color w:val="24364B"/>
+                <w:sz w:val="18"/>
+              </w:rPr>
+              <w:t>Email analyste</w:t>
+            </w:r>
+          </w:p>
+        </w:tc>
+        <w:tc>
+          <w:tcPr>
+            <w:tcW w:type="dxa" w:w="4989"/>
+            <w:tcMar>
+              <w:top w:w="65" w:type="dxa"/>
+              <w:start w:w="105" w:type="dxa"/>
+              <w:bottom w:w="65" w:type="dxa"/>
+              <w:end w:w="105" w:type="dxa"/>
+            </w:tcMar>
+            <w:tcBorders>
+              <w:bottom w:val="single" w:sz="3" w:color="D9E0E8"/>
+            </w:tcBorders>
+            <w:vAlign w:val="center"/>
+          </w:tcPr>
+          <w:p>
+            <w:pPr>
+              <w:spacing w:after="0" w:line="240" w:lineRule="auto"/>
+            </w:pPr>
+            <w:r>
+              <w:rPr>
+                <w:rFonts w:ascii="Arial" w:hAnsi="Arial" w:cs="Arial" w:eastAsia="Arial"/>
+                <w:b w:val="0"/>
+                <w:color w:val="172033"/>
+                <w:sz w:val="18"/>
+              </w:rPr>
+              <w:t>{{ANALYST_EMAIL}}</w:t>
+            </w:r>
+          </w:p>
+        </w:tc>
+      </w:tr>
+      <w:tr>
+        <w:trPr>
+          <w:cantSplit/>
+        </w:trPr>
+        <w:tc>
+          <w:tcPr>
+            <w:tcW w:type="dxa" w:w="4989"/>
+            <w:tcMar>
+              <w:top w:w="65" w:type="dxa"/>
+              <w:start w:w="105" w:type="dxa"/>
+              <w:bottom w:w="65" w:type="dxa"/>
+              <w:end w:w="105" w:type="dxa"/>
+            </w:tcMar>
+            <w:tcBorders>
+              <w:bottom w:val="single" w:sz="3" w:color="D9E0E8"/>
+            </w:tcBorders>
+            <w:vAlign w:val="center"/>
+            <w:shd w:val="clear" w:color="auto" w:fill="F4F6FA"/>
+          </w:tcPr>
+          <w:p>
+            <w:pPr>
+              <w:spacing w:after="0" w:line="240" w:lineRule="auto"/>
+            </w:pPr>
+            <w:r>
+              <w:rPr>
+                <w:rFonts w:ascii="Arial" w:hAnsi="Arial" w:cs="Arial" w:eastAsia="Arial"/>
+                <w:b/>
+                <w:color w:val="24364B"/>
+                <w:sz w:val="18"/>
+              </w:rPr>
+              <w:t>Rendez-vous</w:t>
+            </w:r>
+          </w:p>
+        </w:tc>
+        <w:tc>
+          <w:tcPr>
+            <w:tcW w:type="dxa" w:w="4989"/>
+            <w:tcMar>
+              <w:top w:w="65" w:type="dxa"/>
+              <w:start w:w="105" w:type="dxa"/>
+              <w:bottom w:w="65" w:type="dxa"/>
+              <w:end w:w="105" w:type="dxa"/>
+            </w:tcMar>
+            <w:tcBorders>
+              <w:bottom w:val="single" w:sz="3" w:color="D9E0E8"/>
+            </w:tcBorders>
+            <w:vAlign w:val="center"/>
+          </w:tcPr>
+          <w:p>
+            <w:pPr>
+              <w:spacing w:after="0" w:line="240" w:lineRule="auto"/>
+            </w:pPr>
+            <w:r>
+              <w:rPr>
+                <w:rFonts w:ascii="Arial" w:hAnsi="Arial" w:cs="Arial" w:eastAsia="Arial"/>
+                <w:b w:val="0"/>
+                <w:color w:val="172033"/>
+                <w:sz w:val="18"/>
+              </w:rPr>
+              <w:t>{{APPOINTMENT_DATE}}</w:t>
+            </w:r>
+          </w:p>
+        </w:tc>
+      </w:tr>
+    </w:tbl>
     <w:sectPr>
-      <w:footerReference w:type="default" r:id="rId9"/>
-      <w:headerReference w:type="default" r:id="rId10"/>
-      <w:pgSz w:w="11909" w:h="16834"/>
-      <w:pgMar w:top="1440" w:right="1440" w:bottom="1440" w:left="1440" w:header="720" w:footer="720" w:gutter="0"/>
+      <w:headerReference w:type="default" r:id="rId9"/>
+      <w:footerReference w:type="default" r:id="rId10"/>
+      <w:pgSz w:w="11906" w:h="16838"/>
+      <w:pgMar w:top="907" w:right="964" w:bottom="992" w:left="964" w:header="340" w:footer="340" w:gutter="0"/>
       <w:cols w:space="720"/>
       <w:docGrid w:linePitch="360"/>
     </w:sectPr>
@@ -438,18 +1871,110 @@
 
 <file path=word/footer1.xml><?xml version="1.0" encoding="utf-8"?>
 <w:ftr xmlns:m="http://schemas.openxmlformats.org/officeDocument/2006/math" xmlns:mc="http://schemas.openxmlformats.org/markup-compatibility/2006" xmlns:mo="http://schemas.microsoft.com/office/mac/office/2008/main" xmlns:mv="urn:schemas-microsoft-com:mac:vml" xmlns:o="urn:schemas-microsoft-com:office:office" xmlns:r="http://schemas.openxmlformats.org/officeDocument/2006/relationships" xmlns:v="urn:schemas-microsoft-com:vml" xmlns:w10="urn:schemas-microsoft-com:office:word" xmlns:w14="http://schemas.microsoft.com/office/word/2010/wordml" xmlns:w="http://schemas.openxmlformats.org/wordprocessingml/2006/main" xmlns:wne="http://schemas.microsoft.com/office/word/2006/wordml" xmlns:wp14="http://schemas.microsoft.com/office/word/2010/wordprocessingDrawing" xmlns:wp="http://schemas.openxmlformats.org/drawingml/2006/wordprocessingDrawing" xmlns:wpc="http://schemas.microsoft.com/office/word/2010/wordprocessingCanvas" xmlns:wpg="http://schemas.microsoft.com/office/word/2010/wordprocessingGroup" xmlns:wpi="http://schemas.microsoft.com/office/word/2010/wordprocessingInk" xmlns:wps="http://schemas.microsoft.com/office/word/2010/wordprocessingShape" mc:Ignorable="w14 wp14">
-  <w:p>
-    <w:pPr>
-      <w:pStyle w:val="Footer"/>
-    </w:pPr>
-    <w:r/>
-    <w:r>
-      <w:rPr>
-        <w:sz w:val="18"/>
-      </w:rPr>
-      <w:t>Document généré automatiquement par PLAGENOR 4.0 · ESSBO</w:t>
-    </w:r>
-  </w:p>
+  <w:tbl>
+    <w:tblPr>
+      <w:tblW w:type="auto" w:w="0"/>
+      <w:tblLayout w:type="fixed"/>
+      <w:tblLook w:firstColumn="1" w:firstRow="1" w:lastColumn="0" w:lastRow="0" w:noHBand="0" w:noVBand="1" w:val="04A0"/>
+    </w:tblPr>
+    <w:tblGrid>
+      <w:gridCol w:w="4932"/>
+      <w:gridCol w:w="4932"/>
+    </w:tblGrid>
+    <w:tr>
+      <w:tc>
+        <w:tcPr>
+          <w:tcW w:type="dxa" w:w="7087"/>
+          <w:tcMar>
+            <w:top w:w="70" w:type="dxa"/>
+            <w:start w:w="0" w:type="dxa"/>
+            <w:bottom w:w="20" w:type="dxa"/>
+            <w:end w:w="0" w:type="dxa"/>
+          </w:tcMar>
+          <w:tcBorders>
+            <w:top w:val="single" w:sz="8" w:color="4F46E5"/>
+          </w:tcBorders>
+        </w:tcPr>
+        <w:p>
+          <w:pPr>
+            <w:spacing w:after="0"/>
+          </w:pPr>
+          <w:r>
+            <w:rPr>
+              <w:rFonts w:ascii="Arial" w:hAnsi="Arial" w:cs="Arial" w:eastAsia="Arial"/>
+              <w:b w:val="0"/>
+              <w:color w:val="64748B"/>
+              <w:sz w:val="15"/>
+            </w:rPr>
+            <w:t>PLAGENOR — Plateforme Technologique en Génomique</w:t>
+          </w:r>
+          <w:r>
+            <w:rPr>
+              <w:rFonts w:ascii="Arial" w:hAnsi="Arial" w:cs="Arial" w:eastAsia="Arial"/>
+              <w:b w:val="0"/>
+              <w:color w:val="64748B"/>
+              <w:sz w:val="15"/>
+            </w:rPr>
+            <w:t xml:space="preserve">  ·  {{DISPLAY_ID}}</w:t>
+          </w:r>
+        </w:p>
+      </w:tc>
+      <w:tc>
+        <w:tcPr>
+          <w:tcW w:type="dxa" w:w="2778"/>
+          <w:tcMar>
+            <w:top w:w="70" w:type="dxa"/>
+            <w:start w:w="0" w:type="dxa"/>
+            <w:bottom w:w="20" w:type="dxa"/>
+            <w:end w:w="0" w:type="dxa"/>
+          </w:tcMar>
+          <w:tcBorders>
+            <w:top w:val="single" w:sz="8" w:color="4F46E5"/>
+          </w:tcBorders>
+        </w:tcPr>
+        <w:p>
+          <w:pPr>
+            <w:spacing w:after="0"/>
+            <w:jc w:val="right"/>
+          </w:pPr>
+          <w:r>
+            <w:rPr>
+              <w:rFonts w:ascii="Arial" w:hAnsi="Arial" w:cs="Arial" w:eastAsia="Arial"/>
+              <w:b w:val="0"/>
+              <w:color w:val="64748B"/>
+              <w:sz w:val="15"/>
+            </w:rPr>
+            <w:t xml:space="preserve">Page </w:t>
+          </w:r>
+          <w:fldSimple w:instr="PAGE">
+            <w:r>
+              <w:rPr>
+                <w:color w:val="64748B"/>
+              </w:rPr>
+              <w:t>1</w:t>
+            </w:r>
+          </w:fldSimple>
+          <w:r>
+            <w:rPr>
+              <w:rFonts w:ascii="Arial" w:hAnsi="Arial" w:cs="Arial" w:eastAsia="Arial"/>
+              <w:b w:val="0"/>
+              <w:color w:val="64748B"/>
+              <w:sz w:val="15"/>
+            </w:rPr>
+            <w:t xml:space="preserve"> / </w:t>
+          </w:r>
+          <w:fldSimple w:instr="NUMPAGES">
+            <w:r>
+              <w:rPr>
+                <w:color w:val="64748B"/>
+              </w:rPr>
+              <w:t>1</w:t>
+            </w:r>
+          </w:fldSimple>
+        </w:p>
+      </w:tc>
+    </w:tr>
+  </w:tbl>
 </w:ftr>
 </file>
 
@@ -463,7 +1988,7 @@
     <w:r>
       <w:drawing>
         <wp:inline xmlns:a="http://schemas.openxmlformats.org/drawingml/2006/main" xmlns:pic="http://schemas.openxmlformats.org/drawingml/2006/picture">
-          <wp:extent cx="5943600" cy="725119"/>
+          <wp:extent cx="6083999" cy="742248"/>
           <wp:docPr id="1" name="Picture 1"/>
           <wp:cNvGraphicFramePr>
             <a:graphicFrameLocks noChangeAspect="1"/>
@@ -484,7 +2009,7 @@
                 <pic:spPr>
                   <a:xfrm>
                     <a:off x="0" y="0"/>
-                    <a:ext cx="5943600" cy="725119"/>
+                    <a:ext cx="6083999" cy="742248"/>
                   </a:xfrm>
                   <a:prstGeom prst="rect"/>
                 </pic:spPr>
@@ -861,8 +2386,13 @@
     <w:name w:val="Normal"/>
     <w:qFormat/>
     <w:rsid w:val="00FC693F"/>
+    <w:pPr>
+      <w:spacing w:line="259" w:lineRule="auto" w:after="60"/>
+    </w:pPr>
     <w:rPr>
-      <w:sz w:val="22"/>
+      <w:rFonts w:ascii="Arial" w:hAnsi="Arial" w:cs="Arial" w:eastAsia="Arial"/>
+      <w:color w:val="172033"/>
+      <w:sz w:val="19"/>
     </w:rPr>
   </w:style>
   <w:style w:type="paragraph" w:styleId="Header">
@@ -920,15 +2450,15 @@
     <w:pPr>
       <w:keepNext/>
       <w:keepLines/>
-      <w:spacing w:before="480" w:after="0"/>
+      <w:spacing w:before="220" w:after="80"/>
       <w:outlineLvl w:val="0"/>
     </w:pPr>
     <w:rPr>
-      <w:rFonts w:asciiTheme="majorHAnsi" w:eastAsiaTheme="majorEastAsia" w:hAnsiTheme="majorHAnsi" w:cstheme="majorBidi"/>
+      <w:rFonts w:asciiTheme="majorHAnsi" w:eastAsiaTheme="majorEastAsia" w:hAnsiTheme="majorHAnsi" w:cstheme="majorBidi" w:ascii="Arial" w:hAnsi="Arial"/>
       <w:b/>
       <w:bCs/>
-      <w:color w:val="365F91" w:themeColor="accent1" w:themeShade="BF"/>
-      <w:sz w:val="28"/>
+      <w:color w:val="24364B"/>
+      <w:sz w:val="27"/>
       <w:szCs w:val="28"/>
     </w:rPr>
   </w:style>
@@ -944,15 +2474,15 @@
     <w:pPr>
       <w:keepNext/>
       <w:keepLines/>
-      <w:spacing w:before="200" w:after="0"/>
+      <w:spacing w:before="140" w:after="60"/>
       <w:outlineLvl w:val="1"/>
     </w:pPr>
     <w:rPr>
-      <w:rFonts w:asciiTheme="majorHAnsi" w:eastAsiaTheme="majorEastAsia" w:hAnsiTheme="majorHAnsi" w:cstheme="majorBidi"/>
+      <w:rFonts w:asciiTheme="majorHAnsi" w:eastAsiaTheme="majorEastAsia" w:hAnsiTheme="majorHAnsi" w:cstheme="majorBidi" w:ascii="Arial" w:hAnsi="Arial"/>
       <w:b/>
       <w:bCs/>
-      <w:color w:val="4F81BD" w:themeColor="accent1"/>
-      <w:sz w:val="26"/>
+      <w:color w:val="172033"/>
+      <w:sz w:val="23"/>
       <w:szCs w:val="26"/>
     </w:rPr>
   </w:style>
@@ -968,14 +2498,15 @@
     <w:pPr>
       <w:keepNext/>
       <w:keepLines/>
-      <w:spacing w:before="200" w:after="0"/>
+      <w:spacing w:before="100" w:after="40"/>
       <w:outlineLvl w:val="2"/>
     </w:pPr>
     <w:rPr>
-      <w:rFonts w:asciiTheme="majorHAnsi" w:eastAsiaTheme="majorEastAsia" w:hAnsiTheme="majorHAnsi" w:cstheme="majorBidi"/>
+      <w:rFonts w:asciiTheme="majorHAnsi" w:eastAsiaTheme="majorEastAsia" w:hAnsiTheme="majorHAnsi" w:cstheme="majorBidi" w:ascii="Arial" w:hAnsi="Arial"/>
       <w:b/>
       <w:bCs/>
-      <w:color w:val="4F81BD" w:themeColor="accent1"/>
+      <w:color w:val="64748B"/>
+      <w:sz w:val="21"/>
     </w:rPr>
   </w:style>
   <w:style w:type="paragraph" w:styleId="Heading4">
@@ -1206,18 +2737,20 @@
     <w:qFormat/>
     <w:rsid w:val="00FC693F"/>
     <w:pPr>
+      <w:keepNext/>
       <w:pBdr>
         <w:bottom w:val="single" w:sz="8" w:space="4" w:color="4F81BD" w:themeColor="accent1"/>
       </w:pBdr>
-      <w:spacing w:after="300" w:line="240" w:lineRule="auto"/>
+      <w:spacing w:after="120" w:line="240" w:lineRule="auto" w:before="0"/>
       <w:contextualSpacing/>
     </w:pPr>
     <w:rPr>
-      <w:rFonts w:asciiTheme="majorHAnsi" w:eastAsiaTheme="majorEastAsia" w:hAnsiTheme="majorHAnsi" w:cstheme="majorBidi"/>
-      <w:color w:val="17365D" w:themeColor="text2" w:themeShade="BF"/>
+      <w:rFonts w:asciiTheme="majorHAnsi" w:eastAsiaTheme="majorEastAsia" w:hAnsiTheme="majorHAnsi" w:cstheme="majorBidi" w:ascii="Arial" w:hAnsi="Arial"/>
+      <w:b/>
+      <w:color w:val="24364B"/>
       <w:spacing w:val="5"/>
       <w:kern w:val="28"/>
-      <w:sz w:val="52"/>
+      <w:sz w:val="40"/>
       <w:szCs w:val="52"/>
     </w:rPr>
   </w:style>

</xml_diff>